<commit_message>
Parlar: viikon 36 julkaisutehtävä oman puhelimen hotspotin kautta (koulun verkon sijaan)
Co-Authored-By: Claude Fable 5 <noreply@anthropic.com>
Claude-Session: https://claude.ai/code/session_01WLu7m3NNTZnXJVQ9kuPvzX
</commit_message>
<xml_diff>
--- a/parlar-ioniano/downloads/parlar-ioniano-tyopaketti.docx
+++ b/parlar-ioniano/downloads/parlar-ioniano-tyopaketti.docx
@@ -1401,7 +1401,7 @@
           <w:sz w:val="21"/>
           <w:szCs w:val="21"/>
         </w:rPr>
-        <w:t xml:space="preserve">☐  Open the local server on your phone over the local network, then publish the empty site to GitHub Pages.</w:t>
+        <w:t xml:space="preserve">☐  Create a hotspot on your phone, connect your computer to it, open the local server on the phone, and publish the empty site to GitHub Pages over your own connection.</w:t>
       </w:r>
     </w:p>
     <w:p>
@@ -2706,7 +2706,7 @@
           <w:sz w:val="19"/>
           <w:szCs w:val="19"/>
         </w:rPr>
-        <w:t xml:space="preserve">☐  Verkkoyhteyden jako – The local web server shared to the local network and tested on a phone, with the security notes (wk 36).</w:t>
+        <w:t xml:space="preserve">☐  Verkkoyhteyden jako – The local web server shared over your own phone hotspot and tested on the phone, with the security notes (wk 36).</w:t>
       </w:r>
     </w:p>
     <w:p>

</xml_diff>

<commit_message>
Parlar vk 36: vain verkkojako — paikallista palvelinta ei enää jaeta puhelimeen, julkaisu oman hotspotin yli
Co-Authored-By: Claude Fable 5 <noreply@anthropic.com>
Claude-Session: https://claude.ai/code/session_01WLu7m3NNTZnXJVQ9kuPvzX
</commit_message>
<xml_diff>
--- a/parlar-ioniano/downloads/parlar-ioniano-tyopaketti.docx
+++ b/parlar-ioniano/downloads/parlar-ioniano-tyopaketti.docx
@@ -1401,7 +1401,7 @@
           <w:sz w:val="21"/>
           <w:szCs w:val="21"/>
         </w:rPr>
-        <w:t xml:space="preserve">☐  Create a hotspot on your phone, connect your computer to it, open the local server on the phone, and publish the empty site to GitHub Pages over your own connection.</w:t>
+        <w:t xml:space="preserve">☐  Create a hotspot on your phone, connect your computer to it, and publish the empty site to GitHub Pages over your own connection.</w:t>
       </w:r>
     </w:p>
     <w:p>
@@ -2706,7 +2706,7 @@
           <w:sz w:val="19"/>
           <w:szCs w:val="19"/>
         </w:rPr>
-        <w:t xml:space="preserve">☐  Verkkoyhteyden jako – The local web server shared over your own phone hotspot and tested on the phone, with the security notes (wk 36).</w:t>
+        <w:t xml:space="preserve">☐  Verkkoyhteyden jako – Your phone's connection shared to the computer by hotspot and the first deploy published over it, with the security notes (wk 36).</w:t>
       </w:r>
     </w:p>
     <w:p>

</xml_diff>